<commit_message>
Rà soát toàn bộ bài nói Mở đầu đến Phần XV, bản cuối
- Nhắc lại cụ thể mọi danh sách đánh số khi được nhắc tới: bảy câu hỏi
  mục tiêu, bốn trường hợp trích dẫn, bốn nguyên tắc APA, bốn nhóm format,
  bảy quy định soạn thảo, bảy phần khung điểm, bảy dấu hiệu chất lượng cao,
  chín mục báo cáo tiến độ, sáu mốc đường găng, mười nội dung chuyên sâu,
  mười hai câu checklist và các ô của sơ đồ tổng kết
- Sửa ba lỗi thiếu dấu chấm giữa hai câu và một nhận định chưa chính xác
  về nhận định cá nhân (Slide 14)
- Thêm câu chốt cho các slide còn thiếu luận điểm rõ (Slide 2, 10, 14, 23, 30-31, 98)
- Rút gọn các đoạn lặp ý để tổng độ dài lời nói không tăng

Co-Authored-By: Claude Opus 5.5 <noreply@anthropic.com>
Claude-Session: https://claude.ai/code/session_018fvDs5YVdMu929akP2CKw7
</commit_message>
<xml_diff>
--- a/Core_Slide_1_HD1_bai_noi_hoan_chinh.docx
+++ b/Core_Slide_1_HD1_bai_noi_hoan_chinh.docx
@@ -172,7 +172,7 @@
         <w:spacing w:after="160"/>
       </w:pPr>
       <w:r>
-        <w:t>Vì sao thầy dừng ở bốn ô này? Bởi vì rất nhiều bạn bước vào tám tuần làm khóa luận với cảm giác mơ hồ: không biết bắt đầu từ đâu, không biết bài thế nào là đạt, không biết tám tuần có đủ không. Bốn ô này trả lời ngay từ đầu rằng hôm nay mình học bức tranh toàn cảnh, tức là hiểu cả hành trình gồm những chặng nào và vì sao phải đi theo thứ tự đó. Hôm nay mình chưa học kỹ thuật, công thức hay phần mềm. Lý do là nếu học kỹ thuật trước khi thấy toàn cảnh thì các em biết làm từng việc nhỏ mà không hiểu vì sao phải làm, nên rất dễ làm sai thứ tự của cả quy trình.</w:t>
+        <w:t>Vì sao thầy dừng ở bốn ô này? Bởi vì rất nhiều bạn bước vào tám tuần làm khóa luận mà không biết bắt đầu từ đâu, không biết bài thế nào là đạt, không biết tám tuần có đủ không. Bốn ô này trả lời ngay rằng hôm nay mình học bức tranh toàn cảnh, tức cả hành trình gồm những chặng nào và vì sao phải đi đúng thứ tự đó, chứ chưa học kỹ thuật, công thức hay phần mềm. Học kỹ thuật trước khi thấy toàn cảnh thì các em biết làm từng việc nhỏ mà không hiểu vì sao phải làm, nên rất dễ làm sai thứ tự của cả quy trình.</w:t>
       </w:r>
     </w:p>
     <w:p>
@@ -204,15 +204,21 @@
         <w:spacing w:after="160"/>
       </w:pPr>
       <w:r>
-        <w:t>Toàn cảnh đó gồm sáu chặng như trên slide và mỗi chặng kết thúc bằng một sản phẩm cụ thể. Các em đọc cột bên phải của bảng sẽ thấy: chặng một xong khi đề tài được giảng viên hướng dẫn xác nhận là khả thi; chặng hai xong khi có bản research proposal đủ mười lăm thành phần; chặng ba xong khi đề cương đủ mười mục đã được duyệt; chặng bốn xong khi có bản thảo từng chương; chặng năm xong khi có dữ liệu thật và kết quả đã được diễn giải; chặng sáu xong khi bản hoàn chỉnh đúng format, đúng số trang và sẵn sàng nộp. Mười lăm thành phần của proposal là gì thì mình học ở Phần bốn, còn mười mục của đề cương là gì thì mình học ở Phần năm.</w:t>
-      </w:r>
-    </w:p>
-    <w:p>
-      <w:pPr>
-        <w:spacing w:after="160"/>
-      </w:pPr>
-      <w:r>
-        <w:t>Vì sao phải chia thành chặng và bắt buộc mỗi chặng có một sản phẩm? Bởi vì nếu không có mốc cụ thể thì các em rất dễ tưởng mình đang tiến lên, trong khi thật ra chỉ đang loay hoay. Có sản phẩm rồi thì các em chỉ cần tự hỏi sản phẩm của chặng này đã có trong tay chưa, nếu chưa có thì chưa sang chặng sau.</w:t>
+        <w:t>Toàn cảnh đó gồm sáu chặng và mỗi chặng kết thúc bằng một sản phẩm cụ thể, ghi ở cột phải của bảng. Trong đó có hai sản phẩm các em sẽ nghe suốt buổi. Sản phẩm của chặng hai là research proposal đủ mười lăm thành phần, tức mười lăm nội dung đi từ tên đề tài, vấn đề, mục tiêu, câu hỏi cho tới phương pháp, dữ liệu và kế hoạch thực hiện, học ở Phần bốn. Sản phẩm của chặng ba là đề cương đủ mười mục bắt buộc, từ Mục 1 giới thiệu tới Mục 10 bố cục dự kiến, học ở Phần năm.</w:t>
+      </w:r>
+    </w:p>
+    <w:p>
+      <w:pPr>
+        <w:spacing w:after="160"/>
+      </w:pPr>
+      <w:r>
+        <w:t xml:space="preserve">Vì sao phải chia chặng và bắt buộc mỗi chặng có sản phẩm? Bởi vì không có mốc cụ thể thì các em rất dễ tưởng mình đang tiến lên, trong khi thật ra chỉ đang loay hoay. </w:t>
+      </w:r>
+      <w:r>
+        <w:rPr>
+          <w:b/>
+        </w:rPr>
+        <w:t>Sản phẩm của chặng này chưa có trong tay thì chưa được sang chặng sau.</w:t>
       </w:r>
     </w:p>
     <w:p>
@@ -249,7 +255,7 @@
         <w:spacing w:after="160"/>
       </w:pPr>
       <w:r>
-        <w:t>Slide này cho các em biết cuối buổi học mình cần tự trả lời được bảy câu hỏi ở cột trái, từ câu "tôi đang làm công trình gì" cho tới câu "sản phẩm nào cần hoàn thành từng tuần". Bảy câu này đi theo đúng thứ tự của sáu chặng vừa xem, nên nếu cuối buổi có câu nào các em chưa trả lời rõ thì đó là tín hiệu để quay lại đọc phần tương ứng.</w:t>
+        <w:t>Slide này nêu bảy câu hỏi mà cuối buổi các em phải tự trả lời được: tôi đang làm công trình gì, bắt đầu từ đâu, chọn đề tài thế nào, research proposal dùng để làm gì, mỗi chương có nhiệm vụ gì, bài được đánh giá theo tiêu chí nào và mỗi tuần phải hoàn thành sản phẩm nào. Bảy câu này đi đúng thứ tự sáu chặng vừa xem, nên câu nào cuối buổi chưa trả lời rõ thì đó là tín hiệu quay lại phần tương ứng.</w:t>
       </w:r>
     </w:p>
     <w:p>
@@ -278,7 +284,7 @@
         <w:spacing w:after="160"/>
       </w:pPr>
       <w:r>
-        <w:t>Ba slide tiếp theo là bản đồ nội dung, mỗi slide giới thiệu một nhóm phần kèm thông điệp chính của từng phần. Thầy không đọc lại từng dòng mà chỉ chỉ ra các phần nối với nhau như thế nào.</w:t>
+        <w:t>Ba slide tiếp theo là bản đồ nội dung, thầy chỉ ra các phần nối với nhau thế nào.</w:t>
       </w:r>
     </w:p>
     <w:p>
@@ -318,15 +324,7 @@
         <w:spacing w:after="160"/>
       </w:pPr>
       <w:r>
-        <w:t>Năm phần tiếp theo có vai trò khác. Nếu Phần một tới Phần sáu dựng nên nội dung của khóa luận thì Phần bảy tới Phần mười một kiểm tra nội dung đó từ nhiều góc nhìn. Phần bảy kiểm tra cấu trúc, tức năm chương có nối thành một mạch lập luận hay không. Phần tám kiểm tra tính trung thực thông qua trích dẫn. Phần chín kiểm tra dưới góc nhìn người đọc thông qua format. Phần mười kiểm tra thủ tục, tức bảy bước từ lúc đăng ký đề tài tới lúc nhận điểm. Phần mười một kiểm tra dưới góc nhìn người chấm.</w:t>
-      </w:r>
-    </w:p>
-    <w:p>
-      <w:pPr>
-        <w:spacing w:after="160"/>
-      </w:pPr>
-      <w:r>
-        <w:t>Nói cách khác, cùng một cuốn khóa luận nhưng sẽ được soi từ năm phía khác nhau.</w:t>
+        <w:t>Năm phần tiếp theo có vai trò khác. Nếu Phần một tới Phần sáu dựng nên nội dung thì Phần bảy tới Phần mười một kiểm tra nội dung đó từ năm phía: Phần bảy kiểm tra năm chương có nối thành một mạch lập luận không, Phần tám kiểm tra tính trung thực qua trích dẫn, Phần chín kiểm tra dưới mắt người đọc qua format, Phần mười kiểm tra thủ tục gồm bảy bước từ đăng ký đề tài tới nhận điểm, còn Phần mười một kiểm tra dưới mắt người chấm.</w:t>
       </w:r>
     </w:p>
     <w:p>
@@ -410,7 +408,7 @@
         <w:spacing w:after="160"/>
       </w:pPr>
       <w:r>
-        <w:t>Phần một chỉ có ba slide nhưng đặt nền cho cả buổi. Trước khi làm bất cứ điều gì, các em cần biết chính xác mình đang tạo ra loại sản phẩm nào. Nếu không phân biệt được chuyên đề với khóa luận thì các em sẽ đặt sai kỳ vọng, sai độ sâu và sai cách viết cho cả tám tuần sau đó. Ba câu hỏi trên slide là ba điều mình sẽ trả lời trong phần này.</w:t>
+        <w:t>Phần một chỉ có ba slide nhưng đặt nền cho cả buổi, vì hiểu sai loại công trình mình đang làm thì cả tám tuần sau sẽ sai kỳ vọng, sai độ sâu và sai cách viết. Ba câu hỏi trên slide là ba điều mình trả lời trong phần này.</w:t>
       </w:r>
     </w:p>
     <w:p>
@@ -559,7 +557,13 @@
         <w:spacing w:after="160"/>
       </w:pPr>
       <w:r>
-        <w:t>Dòng cuối slide là điều thầy muốn các em nhớ nhất. Dù là chuyên đề hay khóa luận, người chấm đều nhìn vào ba việc: các em có tự đặt câu hỏi không, có tự thu thập hoặc phân tích bằng chứng không, có tự rút ra kết luận của riêng mình không.</w:t>
+        <w:t xml:space="preserve">Dòng cuối slide là điều thầy muốn các em nhớ nhất. </w:t>
+      </w:r>
+      <w:r>
+        <w:rPr>
+          <w:b/>
+        </w:rPr>
+        <w:t>Dù là chuyên đề hay khóa luận, người chấm đều nhìn vào ba việc: các em có tự đặt câu hỏi không, có tự thu thập hoặc phân tích bằng chứng không, có tự rút ra kết luận của riêng mình không.</w:t>
       </w:r>
     </w:p>
     <w:p>
@@ -613,7 +617,7 @@
         <w:spacing w:after="160"/>
       </w:pPr>
       <w:r>
-        <w:t>Phần hai dạy một trình tự suy nghĩ chứ không phải một danh sách thuật ngữ để học thuộc. Đây là phần dễ bị đọc lướt nhất nhưng lại quyết định các em có tránh được lỗi phổ biến nhất của người mới làm nghiên cứu hay không, đó là nhầm ý kiến cá nhân với kết luận nghiên cứu. Ba câu hỏi trên slide là ba việc mình sẽ làm rõ: thứ nhất là phải suy nghĩ theo trình tự nào; thứ hai là quan sát, nhận định cá nhân và vấn đề nghiên cứu khác nhau ở đâu; thứ ba là vấn đề thực tế khác khoảng trống nghiên cứu ở đâu.</w:t>
+        <w:t>Ba câu hỏi trên slide là ba việc của Phần hai: thứ nhất là phải suy nghĩ theo trình tự nào; thứ hai là quan sát, nhận định cá nhân và vấn đề nghiên cứu khác nhau ở đâu; thứ ba là vấn đề thực tế khác khoảng trống nghiên cứu ở đâu. Nắm được ba việc này là các em tránh được lỗi phổ biến nhất của người mới làm nghiên cứu: coi ý kiến cá nhân như thể đã là kết luận.</w:t>
       </w:r>
     </w:p>
     <w:p>
@@ -664,7 +668,7 @@
         <w:spacing w:after="160"/>
       </w:pPr>
       <w:r>
-        <w:t>Nhìn xa hơn một chút, năm bước này chính là bản thu nhỏ của research proposal ở Phần bốn, nơi cùng nguyên lý đó được mở rộng thành mười lăm thành phần.</w:t>
+        <w:t>Nhìn xa hơn, năm bước này chính là bản thu nhỏ của research proposal ở Phần bốn, nơi cùng nguyên lý được mở rộng thành mười lăm thành phần, từ tên đề tài tới kế hoạch thực hiện.</w:t>
       </w:r>
     </w:p>
     <w:p>
@@ -741,15 +745,24 @@
         <w:spacing w:after="160"/>
       </w:pPr>
       <w:r>
-        <w:t>Slide này có ba khái niệm là quan sát, nhận định cá nhân và vấn đề nghiên cứu. Ba khái niệm này mô tả ba mức hiểu khác nhau về cùng một hiện tượng. Quan sát là điều các em nhìn thấy. Nhận định cá nhân là điều các em đoán về cái mình nhìn thấy. Còn vấn đề nghiên cứu là điều các em sẽ kiểm tra bằng dữ liệu.</w:t>
-      </w:r>
-    </w:p>
-    <w:p>
-      <w:pPr>
-        <w:spacing w:after="160"/>
-      </w:pPr>
-      <w:r>
-        <w:t>Điểm mấu chốt nằm ở chữ "kiểm chứng". Một nhận định cá nhân thì không ai chứng minh là sai được, vì nó chỉ là niềm tin của người nói. Trong khi đó, một vấn đề nghiên cứu phải được đặt ra sao cho dữ liệu có thể xác nhận hoặc bác bỏ nó.</w:t>
+        <w:t xml:space="preserve">Slide này có ba khái niệm dễ nhầm nhất. </w:t>
+      </w:r>
+      <w:r>
+        <w:rPr>
+          <w:b/>
+        </w:rPr>
+        <w:t>Quan sát là điều các em nhìn thấy, nhận định cá nhân là điều các em đoán, còn vấn đề nghiên cứu là điều các em sẽ kiểm tra bằng dữ liệu.</w:t>
+      </w:r>
+      <w:r>
+        <w:t xml:space="preserve"> Cả ba có thể nói về cùng một hiện tượng, chỉ khác nhau ở mức độ đã được kiểm chứng.</w:t>
+      </w:r>
+    </w:p>
+    <w:p>
+      <w:pPr>
+        <w:spacing w:after="160"/>
+      </w:pPr>
+      <w:r>
+        <w:t>Điểm mấu chốt nằm ở chữ "kiểm chứng". Một nhận định cá nhân chưa được đặt ở dạng có thể kiểm tra, nên nói nó đúng hay sai đều chỉ là cảm giác. Còn vấn đề nghiên cứu phải được đặt ra sao cho dữ liệu có thể xác nhận hoặc bác bỏ nó.</w:t>
       </w:r>
     </w:p>
     <w:p>
@@ -968,7 +981,7 @@
         <w:spacing w:after="160"/>
       </w:pPr>
       <w:r>
-        <w:t>Chọn sai đề tài là nguyên nhân phổ biến nhất khiến sinh viên bị chậm tiến độ. Nhiều bạn chọn đề tài theo cảm tính, thấy tên nghe hay là chọn. Phần ba giúp các em chuyển việc chọn đề tài từ cảm tính sang một bộ tiêu chí kiểm tra được, để tự kiểm tra đề tài của mình trước khi trình giảng viên hướng dẫn. Đây cũng là bước chuẩn bị trực tiếp cho proposal ở Phần bốn.</w:t>
+        <w:t>Chọn sai đề tài là nguyên nhân phổ biến nhất khiến sinh viên chậm tiến độ, vì nhiều bạn chọn theo cảm tính, thấy tên nghe hay là chọn. Phần ba thay cảm tính bằng một bộ tiêu chí để các em tự kiểm tra đề tài trước khi trình giảng viên hướng dẫn. Đó cũng là bước chuẩn bị trực tiếp cho proposal ở Phần bốn.</w:t>
       </w:r>
     </w:p>
     <w:p>
@@ -1174,15 +1187,18 @@
         <w:spacing w:after="160"/>
       </w:pPr>
       <w:r>
-        <w:t>Mình chạy thử sáu câu qua Case B. Vấn đề có rõ không? Có, đó là tìm xem yếu tố nào ảnh hưởng tới mức hài lòng của phụ huynh với dịch vụ hành chính ở một trường tiểu học cụ thể. Dữ liệu có lấy được không? Cần bảng hỏi phát cho phụ huynh, lấy được nếu trường đồng ý hợp tác hoặc các em đang thực tập ở đó. Tám tuần có đủ không? Có, vì số phụ huynh cần khảo sát ở một trường là vừa phải. Năng lực phân tích có đủ không? Nếu chỉ cần thống kê mô tả và so sánh đơn giản thì đủ, còn nếu phải dùng mô hình hồi quy mà mình chưa học thì phải điều chỉnh phương pháp. Tên đề tài đã rõ chưa? Rõ, vì đã nêu đối tượng và phạm vi. Phương án dự phòng là gì? Cần nghĩ sớm, chẳng hạn chuyển sang khảo sát ở một trường khác nếu trường ban đầu từ chối.</w:t>
-      </w:r>
-    </w:p>
-    <w:p>
-      <w:pPr>
-        <w:spacing w:after="160"/>
-      </w:pPr>
-      <w:r>
-        <w:t>Các em thấy đó, chạy hết sáu câu chỉ mất vài phút nhưng có thể giúp các em tránh được việc phải đổi đề tài ở tuần năm.</w:t>
+        <w:t>Mình chạy thử sáu câu qua Case B. Vấn đề đã rõ: tìm yếu tố ảnh hưởng tới mức hài lòng của phụ huynh ở một trường cụ thể. Dữ liệu lấy được bằng bảng hỏi, nếu trường đồng ý hợp tác. Tám tuần đủ, vì số phụ huynh ở một trường là vừa phải. Năng lực phân tích đủ nếu chỉ cần thống kê mô tả và so sánh đơn giản, còn nếu phải dùng hồi quy mà chưa học thì phải chỉnh phương pháp. Tên đề tài đã nêu đối tượng và phạm vi. Phương án dự phòng là chuyển sang một trường khác nếu trường ban đầu từ chối.</w:t>
+      </w:r>
+    </w:p>
+    <w:p>
+      <w:pPr>
+        <w:spacing w:after="160"/>
+      </w:pPr>
+      <w:r>
+        <w:rPr>
+          <w:b/>
+        </w:rPr>
+        <w:t>Chạy hết sáu câu chỉ mất vài phút nhưng có thể giúp các em khỏi phải đổi đề tài ở tuần năm.</w:t>
       </w:r>
     </w:p>
     <w:p>
@@ -1276,7 +1292,7 @@
         <w:spacing w:after="160"/>
       </w:pPr>
       <w:r>
-        <w:t>Nếu cả buổi hôm nay các em chỉ nhớ được một phần thì thầy mong đó là phần này. Proposal là nơi cách suy nghĩ ở Phần hai và đề tài đã chọn ở Phần ba được ghép lại thành một bản thiết kế cụ thể, để kiểm tra được trước khi các em tốn công viết cả khóa luận. Bốn câu hỏi trên slide là bốn điều mình sẽ trả lời: proposal là gì và vì sao phải làm trước, bỏ qua nó thì chuyện gì xảy ra, nó gồm những thành phần nào, rồi nó liên hệ với đề cương như thế nào.</w:t>
+        <w:t>Proposal là nơi cách suy nghĩ ở Phần hai và đề tài đã chọn ở Phần ba được ghép thành một bản thiết kế, để kiểm tra được trước khi các em tốn công viết cả khóa luận. Bốn câu hỏi trên slide là bốn điều mình sẽ trả lời: proposal là gì và vì sao phải làm trước, bỏ qua nó thì chuyện gì xảy ra, nó gồm những thành phần nào, rồi nó liên hệ với đề cương như thế nào.</w:t>
       </w:r>
     </w:p>
     <w:p>
@@ -1356,15 +1372,15 @@
         <w:spacing w:after="160"/>
       </w:pPr>
       <w:r>
-        <w:t>Vì sao lại là tuần hai? Bởi vì ở tuần hai, proposal mới chỉ là vài trang giấy nên sửa một chỗ sai chỉ mất một buổi. Còn tới tuần năm, tuần sáu thì mỗi chương viết sau đều đã dựa trên chương viết trước, nên sửa một lỗi gốc lúc này kéo theo phải viết lại nhiều chương.</w:t>
-      </w:r>
-    </w:p>
-    <w:p>
-      <w:pPr>
-        <w:spacing w:after="160"/>
-      </w:pPr>
-      <w:r>
-        <w:t>Thử hình dung một bạn chọn đề tài về ý định mua hàng qua livestream, viết thẳng Chương 1 và Chương 2 mà không làm proposal. Tới tuần năm, lúc chuẩn bị đi khảo sát, bạn đó mới phát hiện mô hình ở Chương 2 có năm biến trong khi bảng hỏi chỉ đo được ba biến. Hai biến còn lại cần dữ liệu nội bộ của sàn thương mại điện tử, thứ mà bạn ấy không xin được. Thế là phải quay lại sửa mô hình và sửa cả Chương 2, nên tuần sáu lẽ ra đi thu dữ liệu thì lại ngồi sửa lý thuyết.</w:t>
+        <w:t>Vì sao lại là tuần hai? Bởi vì ở tuần hai proposal mới là vài trang giấy, sửa một chỗ sai chỉ mất một buổi. Tới tuần năm, tuần sáu thì chương sau đã dựa trên chương trước, sửa một lỗi gốc kéo theo phải viết lại nhiều chương.</w:t>
+      </w:r>
+    </w:p>
+    <w:p>
+      <w:pPr>
+        <w:spacing w:after="160"/>
+      </w:pPr>
+      <w:r>
+        <w:t>Thử hình dung một bạn chọn đề tài về ý định mua hàng qua livestream và viết thẳng Chương 1, Chương 2 mà không làm proposal. Tới tuần năm mới phát hiện mô hình có năm biến trong khi bảng hỏi chỉ đo được ba, vì hai biến còn lại cần dữ liệu nội bộ của sàn thương mại điện tử mà bạn ấy không xin được. Thế là tuần sáu lẽ ra đi thu dữ liệu thì lại ngồi sửa mô hình và sửa Chương 2.</w:t>
       </w:r>
     </w:p>
     <w:p>
@@ -1504,23 +1520,29 @@
         <w:spacing w:after="160"/>
       </w:pPr>
       <w:r>
-        <w:t>Để các em có mẫu tham chiếu, mình viết thử mười lăm thành phần cho Case A. Tên đề tài là các yếu tố ảnh hưởng đến ý định sử dụng dịch vụ ngân hàng số của khách hàng cá nhân tại một ngân hàng thương mại trên một địa bàn cụ thể. Bối cảnh là nhiều ngân hàng đầu tư mạnh cho ngân hàng số nhưng tỷ lệ khách hàng cá nhân dùng thường xuyên chưa đồng đều. Vấn đề là ở ngân hàng được chọn, một bộ phận khách hàng cá nhân chưa dùng dịch vụ dù đã được giới thiệu. Lý do cần nghiên cứu là nếu biết đúng yếu tố cản trở thì ngân hàng có căn cứ điều chỉnh cách tiếp cận khách hàng. Mục tiêu là xác định các yếu tố ảnh hưởng tới ý định sử dụng. Câu hỏi là trong cảm nhận về tính hữu ích, cảm nhận về tính dễ sử dụng và mức tin tưởng vào bảo mật, yếu tố nào ảnh hưởng lớn nhất.</w:t>
-      </w:r>
-    </w:p>
-    <w:p>
-      <w:pPr>
-        <w:spacing w:after="160"/>
-      </w:pPr>
-      <w:r>
-        <w:t>Tiếp theo, đối tượng là khách hàng cá nhân đang giao dịch tại ngân hàng đó, còn phạm vi là một địa bàn cụ thể trong năm hiện tại. Cơ sở lý thuyết là lý thuyết chấp nhận công nghệ, vốn đã được nhiều nghiên cứu dùng cho dịch vụ số. Mô hình gồm ba yếu tố vừa nêu tác động tới ý định sử dụng, nên các biến chính là tính hữu ích, tính dễ sử dụng, tin tưởng bảo mật và ý định sử dụng. Phương pháp là khảo sát bằng bảng hỏi rồi phân tích thống kê mô tả và kiểm định mối liên hệ giữa các biến. Nguồn dữ liệu là dữ liệu sơ cấp thu trực tiếp từ khách hàng tại quầy hoặc qua khảo sát trực tuyến do ngân hàng hỗ trợ gửi. Kết quả dự kiến là xác định được yếu tố ảnh hưởng lớn nhất trong ba yếu tố. Kế hoạch thực hiện đi theo khung tám tuần ở Phần mười ba.</w:t>
-      </w:r>
-    </w:p>
-    <w:p>
-      <w:pPr>
-        <w:spacing w:after="160"/>
-      </w:pPr>
-      <w:r>
-        <w:t>Case B được viết theo đúng mười lăm thành phần đó, thầy chỉ nêu những chỗ khác. Tên đề tài là các yếu tố ảnh hưởng đến mức độ hài lòng của phụ huynh đối với dịch vụ hành chính tại một trường tiểu học trên một địa bàn cụ thể. Vấn đề là ở trường được chọn, nhiều phụ huynh chưa hài lòng với thời gian và cách xử lý thủ tục. Câu hỏi là trong thời gian xử lý thủ tục, thái độ phục vụ và mức rõ ràng của thông tin hướng dẫn, yếu tố nào ảnh hưởng lớn nhất tới sự hài lòng. Cơ sở lý thuyết là lý thuyết chất lượng dịch vụ công. Đối tượng là phụ huynh có con đang học tại trường, phạm vi là một trường trong năm học hiện tại. Phương pháp là khảo sát bằng bảng hỏi, có thể kết hợp phỏng vấn ngắn vài phụ huynh nếu còn thời gian. Riêng kế hoạch thực hiện thì cần tính thêm thời gian dự phòng cho thủ tục xin phép nhà trường, đúng như rủi ro mình vừa thấy ở Slide 27.</w:t>
+        <w:t>Để các em có mẫu tham chiếu, mình viết thử mười lăm thành phần cho Case A. Tên đề tài là các yếu tố ảnh hưởng đến ý định sử dụng dịch vụ ngân hàng số của khách hàng cá nhân tại một ngân hàng thương mại. Bối cảnh là ngân hàng đầu tư mạnh cho ngân hàng số mà khách hàng cá nhân dùng chưa đồng đều. Vấn đề là ở ngân hàng được chọn, một bộ phận khách hàng chưa dùng dịch vụ dù đã được giới thiệu. Lý do cần nghiên cứu là biết đúng yếu tố cản trở thì ngân hàng mới có căn cứ điều chỉnh cách tiếp cận. Mục tiêu là xác định các yếu tố ảnh hưởng tới ý định sử dụng, còn câu hỏi là trong tính hữu ích, tính dễ sử dụng và mức tin tưởng vào bảo mật, yếu tố nào ảnh hưởng lớn nhất.</w:t>
+      </w:r>
+    </w:p>
+    <w:p>
+      <w:pPr>
+        <w:spacing w:after="160"/>
+      </w:pPr>
+      <w:r>
+        <w:t xml:space="preserve">Đối tượng là khách hàng cá nhân của ngân hàng đó, phạm vi là một địa bàn trong năm hiện tại. Cơ sở lý thuyết là lý thuyết chấp nhận công nghệ, nên mô hình gồm ba yếu tố vừa nêu tác động tới ý định sử dụng và đó cũng chính là bốn biến chính. Phương pháp là khảo sát bằng bảng hỏi rồi phân tích thống kê và kiểm định mối liên hệ giữa các biến, với nguồn dữ liệu sơ cấp thu tại quầy hoặc qua khảo sát trực tuyến do ngân hàng hỗ trợ gửi. Kết quả dự kiến là chỉ ra yếu tố ảnh hưởng lớn nhất, còn kế hoạch đi theo khung tám tuần ở Phần mười ba. </w:t>
+      </w:r>
+      <w:r>
+        <w:rPr>
+          <w:b/>
+        </w:rPr>
+        <w:t>Các em để ý, mỗi thành phần chỉ một hai câu nhưng câu nào cũng trả lời đúng câu hỏi của nó.</w:t>
+      </w:r>
+    </w:p>
+    <w:p>
+      <w:pPr>
+        <w:spacing w:after="160"/>
+      </w:pPr>
+      <w:r>
+        <w:t>Case B viết theo đúng mười lăm thành phần đó, thầy chỉ nêu chỗ khác. Vấn đề là ở trường được chọn, nhiều phụ huynh chưa hài lòng với thời gian và cách xử lý thủ tục. Câu hỏi là trong thời gian xử lý, thái độ phục vụ và mức rõ ràng của thông tin hướng dẫn, yếu tố nào ảnh hưởng lớn nhất tới sự hài lòng. Cơ sở lý thuyết là lý thuyết chất lượng dịch vụ công. Riêng kế hoạch thực hiện phải tính thêm thời gian dự phòng cho thủ tục xin phép nhà trường, đúng như rủi ro vừa thấy ở Slide 27.</w:t>
       </w:r>
     </w:p>
     <w:p>
@@ -2171,7 +2193,7 @@
         <w:spacing w:after="160"/>
       </w:pPr>
       <w:r>
-        <w:t>Các em để ý là sáu câu này không được xếp ngẫu nhiên. Câu một kiểm tra phần hình thức. Câu hai và câu ba kiểm tra mục tiêu, câu hỏi và phương pháp có khớp nhau không, tức là phương pháp có trả lời đúng câu hỏi và câu hỏi có bám đúng mục tiêu không. Còn câu bốn, câu năm và câu sáu kiểm tra ba mục rất dễ bị viết sơ sài là tổng quan, tiến độ và bố cục.</w:t>
+        <w:t>Các em để ý là sáu câu này không được xếp ngẫu nhiên. Câu một kiểm tra hình thức, tức đã đủ bốn danh mục mở đầu và đủ mười mục đúng thứ tự chưa. Câu hai và câu ba kiểm tra mạch nội dung, tức mục tiêu ở Mục 2.2 có khớp từng câu hỏi ở Mục 3 không và phương pháp ở Mục 5 có trả lời được các câu hỏi đó không. Còn câu bốn, câu năm và câu sáu kiểm tra ba mục rất dễ bị viết sơ sài là tổng quan ở Mục 8, tiến độ ở Mục 9 và bố cục ở Mục 10.</w:t>
       </w:r>
     </w:p>
     <w:p>
@@ -2551,7 +2573,7 @@
         <w:spacing w:after="160"/>
       </w:pPr>
       <w:r>
-        <w:t>Giờ mình nhìn kỹ phần mở đầu. Sáu ý trên slide các em sẽ thấy quen, bởi vì đây chính là phần mở đầu của đề cương, chỉ có điều bây giờ nó được viết đầy đủ hơn.</w:t>
+        <w:t>Giờ mình nhìn kỹ phần mở đầu với sáu ý bắt buộc: lý do chọn đề tài, mục tiêu, câu hỏi nghiên cứu, đối tượng và phạm vi, phương pháp và số liệu, cuối cùng là tóm lược các chương. Các em sẽ thấy quen, vì đây chính là phần mở đầu của đề cương, chỉ có điều bây giờ được viết đầy đủ hơn.</w:t>
       </w:r>
     </w:p>
     <w:p>
@@ -2807,7 +2829,7 @@
         <w:spacing w:after="160"/>
       </w:pPr>
       <w:r>
-        <w:t>Hai cách hiểu này khác nhau ở chỗ nào? Nếu nghĩ theo chủ đề thì các em có thể viết Chương 2 mà không cần nhìn Chương 1. Còn nếu nghĩ theo câu hỏi thì các em không thể viết Chương 2 khi chưa biết Chương 1 hỏi gì Chính việc chương sau buộc phải dựa vào câu hỏi của chương trước là thứ giữ cho cả khóa luận liền mạch.</w:t>
+        <w:t>Hai cách hiểu này khác nhau ở chỗ nào? Nếu nghĩ theo chủ đề thì các em có thể viết Chương 2 mà không cần nhìn Chương 1. Còn nếu nghĩ theo câu hỏi thì các em không thể viết Chương 2 khi chưa biết Chương 1 hỏi gì. Chính việc chương sau buộc phải dựa vào câu hỏi của chương trước là thứ giữ cho cả khóa luận liền mạch.</w:t>
       </w:r>
     </w:p>
     <w:p>
@@ -2874,7 +2896,7 @@
         <w:spacing w:after="160"/>
       </w:pPr>
       <w:r>
-        <w:t>Riêng số chương cụ thể thì như slide ghi, các em thống nhất với giảng viên hướng dẫn, vì năm chương ở đây là cái khung giúp các em hiểu cách các chương nối tiếp nhau.</w:t>
+        <w:t>Số chương cụ thể thì các em thống nhất với giảng viên hướng dẫn, năm chương ở đây là khung để hiểu cách các chương nối nhau.</w:t>
       </w:r>
     </w:p>
     <w:p>
@@ -2933,7 +2955,7 @@
         <w:spacing w:after="160"/>
       </w:pPr>
       <w:r>
-        <w:t>Chuyện này quan trọng bởi vì Chương 2 sẽ đi tìm lý thuyết để trả lời câu hỏi của Chương 1. Câu hỏi mơ hồ thì Chương 2 không biết phải tìm lý thuyết gì Rồi sự mơ hồ đó kéo theo lý thuyết mơ hồ ở Chương 2, bảng hỏi mơ hồ ở Chương 3 và cứ thế tới tận kết luận.</w:t>
+        <w:t>Chuyện này quan trọng bởi vì Chương 2 sẽ đi tìm lý thuyết để trả lời câu hỏi của Chương 1. Câu hỏi mơ hồ thì Chương 2 không biết phải tìm lý thuyết gì. Rồi sự mơ hồ đó kéo theo lý thuyết mơ hồ ở Chương 2, bảng hỏi mơ hồ ở Chương 3 và cứ thế tới tận kết luận.</w:t>
       </w:r>
     </w:p>
     <w:p>
@@ -2995,7 +3017,7 @@
         <w:spacing w:after="160"/>
       </w:pPr>
       <w:r>
-        <w:t>Lỗi thường gặp thì các em đã nghe ở Mục 8 đề cương, tức phần tổng quan lĩnh vực nghiên cứu, đó là liệt kê từng nghiên cứu mà không so sánh. Thầy chỉ nói thêm một ý: tổng hợp có chọn lọc nghĩa là nhóm các nghiên cứu lại, theo chủ đề hoặc theo kết quả, để thấy nhóm nào đồng thuận và nhóm nào còn tranh cãi. Khoảng trống thường nằm ngay ở chỗ còn tranh cãi hoặc ở chỗ chưa ai làm Bảng tổng hợp nghiên cứu mà thầy nói ở Phần sáu, tức bảng mỗi dòng một nghiên cứu và đọc dọc theo từng cột, chính là công cụ cho việc này.</w:t>
+        <w:t>Lỗi thường gặp thì các em đã nghe ở Mục 8 đề cương, tức phần tổng quan lĩnh vực nghiên cứu, đó là liệt kê từng nghiên cứu mà không so sánh. Thầy chỉ nói thêm một ý: tổng hợp có chọn lọc nghĩa là nhóm các nghiên cứu lại, theo chủ đề hoặc theo kết quả, để thấy nhóm nào đồng thuận và nhóm nào còn tranh cãi. Khoảng trống thường nằm ngay ở chỗ còn tranh cãi hoặc ở chỗ chưa ai làm. Bảng tổng hợp nghiên cứu mà thầy nói ở Phần sáu, tức bảng mỗi dòng một nghiên cứu và đọc dọc theo từng cột, chính là công cụ cho việc này.</w:t>
       </w:r>
     </w:p>
     <w:p>
@@ -3322,7 +3344,7 @@
         <w:spacing w:after="160"/>
       </w:pPr>
       <w:r>
-        <w:t>Định nghĩa và bốn trường hợp phải trích dẫn thì các em đọc trên slide. Thầy chỉ dừng ở trường hợp thứ tư, vì đó là chỗ bị hiểu sai nhiều nhất: diễn giải lại nội dung bằng lời của mình.</w:t>
+        <w:t>Slide nêu bốn trường hợp phải trích dẫn: khi dùng số liệu của nguồn khác, khi dùng ý kiến của tác giả khác, khi dùng một khái niệm hay lý thuyết đã có, cuối cùng là khi diễn giải lại nội dung của người khác bằng lời của mình. Thầy chỉ dừng ở trường hợp thứ tư, vì đó là chỗ bị hiểu sai nhiều nhất.</w:t>
       </w:r>
     </w:p>
     <w:p>
@@ -3494,7 +3516,7 @@
         <w:spacing w:after="160"/>
       </w:pPr>
       <w:r>
-        <w:t>Sáu nguyên tắc nằm trên slide, thầy chỉ giải thích lý do đằng sau vài nguyên tắc, vì hiểu được lý do thì các em khỏi phải học thuộc.</w:t>
+        <w:t>Sáu nguyên tắc nằm trên slide. Nguyên tắc thứ nhất là nền của tất cả: mọi ý kiến, số liệu, khái niệm hay nhận định đi mượn đều phải ghi tác giả và năm. Thầy chỉ giải thích lý do đằng sau các nguyên tắc còn lại, vì hiểu lý do thì các em khỏi phải học thuộc.</w:t>
       </w:r>
     </w:p>
     <w:p>
@@ -3567,7 +3589,7 @@
         <w:spacing w:after="160"/>
       </w:pPr>
       <w:r>
-        <w:t>Cuối Phần tám là chuẩn APA với bốn nguyên tắc trong bảng trên slide. Thầy chỉ nói vì sao cần một chuẩn thống nhất.</w:t>
+        <w:t>Cuối Phần tám là chuẩn APA với bốn nguyên tắc: trong bài ghi tên tác giả rồi năm, có dấu phẩy ở giữa, đặt trong ngoặc đơn; từ ba tác giả trở lên thì chỉ ghi tác giả đầu kèm "và cộng sự" ngay từ lần đầu; trong danh mục thì tên sách, tên tạp chí in nghiêng; cuối cùng là danh mục xếp theo thứ tự chữ cái tên tác giả, chia nhóm tiếng Việt và nhóm tiếng nước ngoài. Thầy chỉ nói vì sao cần một chuẩn thống nhất.</w:t>
       </w:r>
     </w:p>
     <w:p>
@@ -3600,7 +3622,7 @@
         <w:spacing w:after="160"/>
       </w:pPr>
       <w:r>
-        <w:t>Bảng tra cứu đầy đủ cho từng loại tài liệu sẽ có ở Core Slide 2, còn ở đây các em nắm bốn nguyên tắc này là đủ để viết đề cương cho đúng hướng.</w:t>
+        <w:t>Bảng tra đầy đủ cho từng loại tài liệu có ở Core Slide 2, còn bốn nguyên tắc này là đủ để viết đề cương đúng hướng.</w:t>
       </w:r>
     </w:p>
     <w:p>
@@ -3688,7 +3710,7 @@
         <w:spacing w:after="160"/>
       </w:pPr>
       <w:r>
-        <w:t>Bốn nhóm format trên slide các em nhìn là thấy, nên cái thầy muốn nói ở đây là cách làm.</w:t>
+        <w:t>Bốn nhóm format trên slide là văn bản, cấu trúc chương, bảng và hình, cuối cùng là phần học thuật gồm số trang, trích dẫn, tài liệu tham khảo và phụ lục. Cái thầy muốn nói ở đây là cách làm.</w:t>
       </w:r>
     </w:p>
     <w:p>
@@ -3795,7 +3817,7 @@
         <w:spacing w:after="160"/>
       </w:pPr>
       <w:r>
-        <w:t>Bảy quy định soạn thảo nằm trên slide, các em cài hết vào file khung như thầy vừa nói là xong, nên thầy không đọc lại mà chỉ nói hai chi tiết các em hay thắc mắc.</w:t>
+        <w:t>Bảy quy định soạn thảo gồm khổ A4, chữ Times New Roman, cỡ chữ mười ba, giãn dòng một phẩy năm, lề trái ba phẩy năm phân và lề phải hai phân, header và footer một phẩy năm phân, số trang đặt giữa phía trên. Các em cài hết vào file khung là xong, thầy chỉ nói hai chi tiết hay bị thắc mắc.</w:t>
       </w:r>
     </w:p>
     <w:p>
@@ -4275,7 +4297,7 @@
         <w:spacing w:after="160"/>
       </w:pPr>
       <w:r>
-        <w:t>Đây là khung điểm thang mười chia theo bảy phần. Các em nhìn cột điểm trên slide trước, đừng vội nhìn cột nội dung, sẽ thấy phân tích vấn đề thực tiễn chiếm ba phẩy năm điểm, cao nhất, cơ sở lý luận được hai điểm, trong khi hình thức trình bày chỉ có một điểm.</w:t>
+        <w:t>Đây là khung điểm thang mười chia theo bảy phần: hình thức trình bày một điểm, phần mở đầu một phẩy năm, cơ sở lý luận hai điểm, phân tích vấn đề thực tiễn ba phẩy năm, đề xuất kiến nghị một điểm, kết luận nửa điểm và điểm thưởng nghiên cứu khoa học nửa điểm. Các em thấy ngay phần phân tích thực tiễn nặng nhất, còn hình thức chỉ chiếm một điểm.</w:t>
       </w:r>
     </w:p>
     <w:p>
@@ -4308,7 +4330,7 @@
         <w:spacing w:after="160"/>
       </w:pPr>
       <w:r>
-        <w:t>Như slide ghi, khung điểm cụ thể do khoa quy định nên con số có thể khác. Tuy vậy cách đọc khung điểm để biết dồn sức vào đâu thì các em dùng được cho mọi khung.</w:t>
+        <w:t>Con số cụ thể do khoa quy định nên có thể khác. Tuy vậy cách đọc khung điểm để biết dồn sức vào đâu thì dùng được cho mọi khung.</w:t>
       </w:r>
     </w:p>
     <w:p>
@@ -4399,7 +4421,7 @@
         <w:spacing w:after="160"/>
       </w:pPr>
       <w:r>
-        <w:t>Bảy dấu hiệu trên slide, gồm bốn dấu hiệu ở phần bài viết và ba dấu hiệu ở phần trình bày, bảo vệ, các em đọc là hiểu, nên thầy chỉ dừng ở dấu hiệu đầu tiên, vì đây là cái tách một bài tốt ra khỏi một bài chỉ đạt: có đóng góp mới, dù nhỏ. Nhiều bạn nghe tới đóng góp mới là nghĩ phải phát minh ra một lý thuyết nhưng không phải vậy. Đóng góp mới có thể là kiểm chứng một mô hình ở một bối cảnh chưa ai làm, có thể là phát hiện một yếu tố mà nghiên cứu trước bỏ qua, hoặc có thể là một kết quả khác với nghiên cứu trước mà các em giải thích được vì sao lại khác.</w:t>
+        <w:t>Bảy dấu hiệu trên slide chia làm hai phía. Ở bài viết có bốn dấu hiệu: có đóng góp mới, bố cục mạch lạc, văn phong khoa học và hầu như không còn lỗi trình bày. Ở phần bảo vệ có ba dấu hiệu: hiểu chắc lý thuyết và phương pháp, trình bày chủ động đúng giờ, trả lời thuyết phục câu hỏi của hội đồng. Thầy dừng ở dấu hiệu đầu tiên, vì đây là cái tách bài tốt ra khỏi bài chỉ đạt. Đóng góp mới không có nghĩa là phát minh ra lý thuyết. Nó có thể là kiểm chứng một mô hình ở bối cảnh chưa ai làm, phát hiện một yếu tố mà nghiên cứu trước bỏ qua, hoặc một kết quả khác nghiên cứu trước mà các em giải thích được vì sao khác.</w:t>
       </w:r>
     </w:p>
     <w:p>
@@ -4453,7 +4475,7 @@
         <w:spacing w:after="160"/>
       </w:pPr>
       <w:r>
-        <w:t>Slide này là phần quy định hành chính, các em đọc bảng là nắm, thầy chỉ nhấn hai chỗ.</w:t>
+        <w:t>Slide này là quy định hành chính, thầy chỉ nhấn hai chỗ.</w:t>
       </w:r>
     </w:p>
     <w:p>
@@ -4483,7 +4505,7 @@
         <w:spacing w:after="160"/>
       </w:pPr>
       <w:r>
-        <w:t>Mốc thời gian và cách xử lý điểm F, F cộng do từng khoa quy định, nên các em hỏi thẳng khoa hoặc giảng viên hướng dẫn, đừng dựa vào lời kể của khóa trước.</w:t>
+        <w:t>Mốc thời gian và cách xử lý điểm F, F cộng do từng khoa quy định, các em hỏi thẳng khoa hoặc giảng viên hướng dẫn chứ đừng dựa vào lời kể của khóa trước.</w:t>
       </w:r>
     </w:p>
     <w:p>
@@ -4748,7 +4770,7 @@
         <w:spacing w:after="160"/>
       </w:pPr>
       <w:r>
-        <w:t>Bốn mục đầu của mẫu báo cáo các em đọc trên slide và cả bốn mục cùng trả lời một câu hỏi: tuần này mình đã thật sự làm được gì. Chữ quan trọng ở đây là chữ "thật sự".</w:t>
+        <w:t>Bốn mục đầu là tuần số, mục tiêu của tuần, việc đã hoàn thành và sản phẩm đã tạo ra. Cả bốn cùng trả lời một câu hỏi: tuần này mình đã thật sự làm được gì. Chữ quan trọng ở đây là chữ "thật sự".</w:t>
       </w:r>
     </w:p>
     <w:p>
@@ -4799,7 +4821,7 @@
         <w:spacing w:after="160"/>
       </w:pPr>
       <w:r>
-        <w:t>Năm mục còn lại đi vào phần khó hơn, đó là cái gì chưa xong và cái gì đang vướng. Thầy dừng lâu ở mục "vấn đề đang gặp phải", vì đây là mục dễ bị viết qua loa nhất, bởi ai cũng ngại thừa nhận mình đang gặp khó khăn.</w:t>
+        <w:t>Năm mục còn lại là bằng chứng của sản phẩm, việc đang thực hiện, vấn đề đang gặp phải, việc cần điều chỉnh và mục tiêu tuần kế tiếp. Nhóm này đi vào phần khó hơn, tức cái gì chưa xong và cái gì đang vướng. Thầy dừng lâu ở mục vấn đề đang gặp phải, vì ai cũng ngại thừa nhận mình đang gặp khó nên đây là mục dễ bị viết qua loa nhất.</w:t>
       </w:r>
     </w:p>
     <w:p>
@@ -5119,15 +5141,15 @@
         <w:spacing w:after="160"/>
       </w:pPr>
       <w:r>
-        <w:t>Đường găng còn đi tiếp qua Chương 4, Chương 5 rồi tới rà soát và nộp bài. Trên toàn bộ đường găng đó, slide chọn ra sáu mốc cần giữ đúng tiến độ hơn mọi việc khác.</w:t>
-      </w:r>
-    </w:p>
-    <w:p>
-      <w:pPr>
-        <w:spacing w:after="160"/>
-      </w:pPr>
-      <w:r>
-        <w:t xml:space="preserve">Nhìn sáu mốc này các em sẽ thấy ba mốc liên quan trực tiếp tới dữ liệu, gồm hoàn thiện công cụ, bắt đầu thu thập và hoàn tất dữ liệu hợp lệ. Vì sao dữ liệu lại chiếm tới một nửa? Bởi vì dữ liệu là chỗ các em ít kiểm soát được nhất: viết chương thì các em tự quyết, còn dữ liệu thì phụ thuộc vào người khác, như người trả lời khảo sát hay đơn vị cung cấp số liệu. </w:t>
+        <w:t>Đường găng còn đi tiếp qua Chương 4, Chương 5 rồi tới rà soát và nộp bài. Trên cả đường găng đó, slide chọn ra sáu mốc cần giữ hơn mọi việc khác: chốt đề tài, hoàn thiện proposal, hoàn thiện công cụ thu thập dữ liệu, bắt đầu thu thập dữ liệu, hoàn tất dữ liệu hợp lệ và hoàn thiện bản thảo cuối.</w:t>
+      </w:r>
+    </w:p>
+    <w:p>
+      <w:pPr>
+        <w:spacing w:after="160"/>
+      </w:pPr>
+      <w:r>
+        <w:t xml:space="preserve">Nhìn sáu mốc này các em sẽ thấy ba mốc ở giữa đều xoay quanh dữ liệu. Vì sao dữ liệu chiếm tới một nửa? Bởi vì đó là chỗ các em ít kiểm soát nhất: viết chương thì các em tự quyết, còn dữ liệu phụ thuộc người trả lời khảo sát hay đơn vị cung cấp số liệu. </w:t>
       </w:r>
       <w:r>
         <w:rPr>
@@ -5229,7 +5251,7 @@
         <w:spacing w:after="160"/>
       </w:pPr>
       <w:r>
-        <w:t>Mười nội dung trên slide có một điểm chung là đều thuộc về kỹ thuật và những thứ này không thể học bằng cách đọc slide tổng quan, mà phải làm, phải thao tác, phải sai rồi sửa.</w:t>
+        <w:t>Mười nội dung trên slide gồm công thức thống kê, thao tác phần mềm, hồi quy, kiểm định độ tin cậy thang đo, thiết kế bảng hỏi chi tiết, cách đọc bài báo khoa học, bảng tra APA đầy đủ, quy định trình bày bảng hình công thức, mười tiêu chí chấm chi tiết và kế hoạch từng tuần. Điểm chung của chúng là đều thuộc về kỹ thuật, nên không học được bằng cách đọc slide tổng quan mà phải làm, phải thao tác, phải sai rồi sửa.</w:t>
       </w:r>
     </w:p>
     <w:p>
@@ -5312,7 +5334,7 @@
         <w:spacing w:after="160"/>
       </w:pPr>
       <w:r>
-        <w:t>Phần cuối gồm mười hai câu hỏi tự kiểm tra chia thành ba nhóm, cùng một sơ đồ tổng kết.</w:t>
+        <w:t>Phần cuối gồm mười hai câu hỏi tự kiểm tra chia làm ba nhóm: bốn câu về nền tảng tư duy, bốn câu về cấu trúc cốt lõi của khóa luận và bốn câu về các chi tiết đề cương, trích dẫn, format và quy trình, cùng một sơ đồ tổng kết.</w:t>
       </w:r>
     </w:p>
     <w:p>
@@ -5337,7 +5359,7 @@
         <w:spacing w:after="160"/>
       </w:pPr>
       <w:r>
-        <w:t>Bốn câu đầu là về nền tảng tư duy và thầy nhấn câu thứ hai: phân biệt quan sát, nhận định cá nhân, vấn đề nghiên cứu và kết luận nghiên cứu. Câu này nghe rất lý thuyết nhưng nó lại chính là gốc của lỗi ở Chương 5, khi một nhận định cá nhân được viết ra như thể đó là kết luận nghiên cứu.</w:t>
+        <w:t>Bốn câu đầu hỏi các em có phân biệt được chuyên đề với khóa luận không, có phân biệt được quan sát, nhận định cá nhân, vấn đề nghiên cứu và kết luận nghiên cứu không, có tự kiểm tra được đề tài an toàn không, có hiểu vì sao proposal phải xong trước khi viết không. Thầy nhấn câu thứ hai, vì nó chính là gốc của lỗi ở Chương 5, khi một nhận định cá nhân được viết ra như thể đó là kết luận nghiên cứu.</w:t>
       </w:r>
     </w:p>
     <w:p>
@@ -5417,7 +5439,7 @@
         <w:spacing w:after="160"/>
       </w:pPr>
       <w:r>
-        <w:t>Bốn câu cuối là về những chi tiết dễ bị xem nhẹ nhất. Trong đó các em để ý câu thứ chín hỏi mục nào của đề cương mình hay viết thiếu nhất. Câu này không hỏi mình biết gì, mà hỏi mình có biết điểm yếu của mình nằm ở đâu không và đó là kiểu tự kiểm tra có ích nhất.</w:t>
+        <w:t>Bốn câu cuối hỏi các em có nhớ mười mục đề cương và mục nào mình hay viết thiếu, có nắm sáu nguyên tắc trích dẫn cùng bốn nguyên tắc APA, có biết đánh số đề mục bốn cấp, đánh số bảng hình và dùng chữ viết tắt, có nắm quy trình bảy bước tới lúc nhận điểm không. Các em để ý câu thứ chín: nó không hỏi mình biết gì mà hỏi mình biết điểm yếu của mình nằm ở đâu. Đó là kiểu tự kiểm tra có ích nhất.</w:t>
       </w:r>
     </w:p>
     <w:p>
@@ -5463,7 +5485,13 @@
         <w:spacing w:after="160"/>
       </w:pPr>
       <w:r>
-        <w:t>Sơ đồ cuối cùng trên slide gói lại toàn bộ hành trình và thầy muốn các em để ý hai chỗ trên đó. Chỗ thứ nhất là điểm xuất phát: sơ đồ bắt đầu từ vấn đề thực tế chứ không bắt đầu từ tên đề tài. Chỗ thứ hai là ô "kết luận có căn cứ", tức là kết luận dựa trên bằng chứng chứ không phải kết luận nghe hay. Hai chỗ đó là hai điều thầy nhắc đi nhắc lại suốt buổi hôm nay, bởi vì chúng làm nên sự khác biệt giữa một nghiên cứu thật và một bài tổng hợp thông tin.</w:t>
+        <w:t xml:space="preserve">Sơ đồ cuối cùng gói lại toàn bộ hành trình: vấn đề thực tế, đề tài an toàn, research proposal, năm chương khóa luận, dữ liệu và bằng chứng, kết luận có căn cứ, đi kèm bản thảo đúng chuẩn số trang và báo cáo tiến độ đủ tám tuần, để cuối cùng ra bản hoàn chỉnh. Thầy muốn các em để ý hai ô. Ô đầu tiên là vấn đề thực tế, tức hành trình bắt đầu từ một điều có thật chứ không từ tên đề tài. Ô thứ hai là kết luận có căn cứ, tức kết luận dựa trên bằng chứng chứ không phải kết luận nghe hay. </w:t>
+      </w:r>
+      <w:r>
+        <w:rPr>
+          <w:b/>
+        </w:rPr>
+        <w:t>Hai ô đó làm nên khác biệt giữa một nghiên cứu thật và một bài tổng hợp thông tin.</w:t>
       </w:r>
     </w:p>
     <w:p>

</xml_diff>

<commit_message>
Bản final bài nói: đổi thuật ngữ và làm rõ các câu nén ý
- Thống nhất thuật ngữ khoảng trống nghiên cứu (research gap) thay cho
  khoảng trống tri thức trong bài nói và trên 10 chỗ ở slide 8, 10, 16,
  30, 39, 46, 48, 53
- Viết lại các câu nén ý bằng ví dụ cụ thể: bốn điều kiện khả thi phải
  cùng đạt (Slide 19), khung phân tích, lợi ích của proposal, thành phần
  proposal chưa đạt, bản tóm tắt tiếng Anh, bài dày và bằng chứng

Co-Authored-By: Claude Opus 5.5 <noreply@anthropic.com>
Claude-Session: https://claude.ai/code/session_018fvDs5YVdMu929akP2CKw7
</commit_message>
<xml_diff>
--- a/Core_Slide_1_HD1_bai_noi_hoan_chinh.docx
+++ b/Core_Slide_1_HD1_bai_noi_hoan_chinh.docx
@@ -445,7 +445,7 @@
         <w:spacing w:after="160"/>
       </w:pPr>
       <w:r>
-        <w:t>Với khóa luận, các em phải tự xây dựng vấn đề nghiên cứu từ một khoảng trống tri thức. Khoảng trống tri thức là một câu hỏi mà những nghiên cứu đã có chưa trả lời rõ, hoặc chưa trả lời trong đúng bối cảnh các em quan tâm. Khái niệm này sẽ được làm rõ thêm ở Phần hai, còn ở đây các em chỉ cần nắm nó là gì.</w:t>
+        <w:t>Với khóa luận, các em phải tự xây dựng vấn đề nghiên cứu từ một khoảng trống nghiên cứu, tiếng Anh gọi là research gap. Khoảng trống nghiên cứu là một câu hỏi mà những nghiên cứu đã có chưa trả lời rõ, hoặc chưa trả lời trong đúng bối cảnh các em quan tâm. Khái niệm này sẽ được làm rõ thêm ở Phần hai, còn ở đây các em chỉ cần nắm nó là gì.</w:t>
       </w:r>
     </w:p>
     <w:p>
@@ -549,7 +549,7 @@
         <w:spacing w:after="160"/>
       </w:pPr>
       <w:r>
-        <w:t>Chẳng hạn, quy mô vấn đề của khóa luận rộng hơn vì phạm vi phải đủ lớn để chứa một khoảng trống tri thức đáng nghiên cứu. Nền tảng lý thuyết của khóa luận đòi hỏi tổng quan sâu hơn vì muốn biết khoảng trống nằm ở đâu thì trước hết phải đọc đủ rộng để biết những gì đã được nghiên cứu rồi. Còn độc lập tư duy cao hơn vì các em phải tự đặt câu hỏi và tự dựng khung phân tích cho mình.</w:t>
+        <w:t>Chẳng hạn, quy mô vấn đề của khóa luận rộng hơn vì phạm vi phải đủ lớn để chứa một khoảng trống nghiên cứu đáng nghiên cứu. Nền tảng lý thuyết của khóa luận đòi hỏi tổng quan sâu hơn vì muốn biết khoảng trống nằm ở đâu thì trước hết phải đọc đủ rộng để biết những gì đã được nghiên cứu rồi. Còn độc lập tư duy cao hơn vì các em phải tự đặt câu hỏi và tự dựng khung phân tích, tức tự chọn lý thuyết nào để dựa vào và những yếu tố nào cần xem xét.</w:t>
       </w:r>
     </w:p>
     <w:p>
@@ -855,7 +855,7 @@
         <w:spacing w:after="160"/>
       </w:pPr>
       <w:r>
-        <w:t>Ở đây thầy cần nối lại với Phần một để các em khỏi thấy mâu thuẫn. Ở Slide 8, mình nói khóa luận xây dựng vấn đề từ khoảng trống tri thức. Slide này làm rõ thêm rằng phần lớn khóa luận đại học thuộc hướng ứng dụng, nên các em chỉ cần chứng minh vấn đề thực tế mình chọn là có thật và đáng nghiên cứu. Việc chứng minh một khoảng trống lý thuyết theo nghĩa học thuật chỉ bắt buộc khi hướng dẫn của ngành hoặc chương trình yêu cầu rõ.</w:t>
+        <w:t>Ở đây thầy cần nối lại với Phần một để các em khỏi thấy mâu thuẫn. Ở Slide 8, mình nói khóa luận xây dựng vấn đề từ khoảng trống nghiên cứu. Slide này làm rõ thêm rằng phần lớn khóa luận đại học thuộc hướng ứng dụng, nên các em chỉ cần chứng minh vấn đề thực tế mình chọn là có thật và đáng nghiên cứu. Việc chứng minh một khoảng trống nghiên cứu theo nghĩa lý thuyết chỉ bắt buộc khi hướng dẫn của ngành hoặc chương trình yêu cầu rõ.</w:t>
       </w:r>
     </w:p>
     <w:p>
@@ -1035,7 +1035,16 @@
         <w:spacing w:after="160"/>
       </w:pPr>
       <w:r>
-        <w:t>Điểm này mới quan trọng: bốn điều kiện phải cùng đạt, không điều kiện nào bù được cho điều kiện nào. Dữ liệu lấy được mà vượt năng lực phân tích thì vẫn là đề tài rủi ro. Đối tượng tiếp cận được mà không làm kịp trong tám tuần thì cũng vẫn là đề tài rủi ro.</w:t>
+        <w:t xml:space="preserve">Điểm này mới quan trọng: </w:t>
+      </w:r>
+      <w:r>
+        <w:rPr>
+          <w:b/>
+        </w:rPr>
+        <w:t>bốn điều kiện phải cùng đạt, vì điều kiện này tốt không bù được cho điều kiện kia yếu.</w:t>
+      </w:r>
+      <w:r>
+        <w:t xml:space="preserve"> Ví dụ thứ nhất, một bạn xin được bộ dữ liệu giao dịch của ngân hàng, tức điều kiện dữ liệu đã đạt. Nhưng muốn phân tích bộ dữ liệu đó phải dùng một mô hình thống kê mà bạn ấy chưa học, tức điều kiện năng lực xử lý không đạt. Có dữ liệu trong tay mà không phân tích được thì đề tài vẫn rủi ro. Ví dụ thứ hai, một bạn tiếp cận được phụ huynh ở ba trường tiểu học, tức điều kiện đối tượng khảo sát đã đạt. Nhưng khảo sát cả ba trường thì cần khoảng mười tuần trong khi chỉ có tám tuần, tức điều kiện thời gian không đạt, nên đề tài cũng vẫn rủi ro. Muốn an toàn thì phải thu hẹp lại còn một trường.</w:t>
       </w:r>
     </w:p>
     <w:p>
@@ -1407,7 +1416,7 @@
         <w:rPr>
           <w:b/>
         </w:rPr>
-        <w:t>Proposal không làm các em chậm lại, mà giúp các em phát hiện lỗi vào lúc việc sửa còn nhẹ nhàng.</w:t>
+        <w:t>Proposal không làm các em chậm lại, mà giúp các em phát hiện lỗi từ tuần hai, khi sửa chỉ mất một buổi, thay vì tới tuần năm mới phát hiện và phải viết lại nhiều chương.</w:t>
       </w:r>
     </w:p>
     <w:p>
@@ -1512,7 +1521,7 @@
         <w:t>Mỗi thành phần không cần viết dài, chỉ cần vài câu nhưng phải trả lời đúng câu hỏi ở cột bên phải.</w:t>
       </w:r>
       <w:r>
-        <w:t xml:space="preserve"> Viết dài mà không trả lời đúng câu hỏi đó thì thành phần đó vẫn chưa đạt.</w:t>
+        <w:t xml:space="preserve"> Chẳng hạn thành phần mục tiêu phải trả lời câu "nghiên cứu này muốn đạt được điều gì". Nếu các em viết nửa trang về tầm quan trọng của ngân hàng số mà không nói nghiên cứu muốn đạt điều gì thì thành phần mục tiêu vẫn chưa đạt, dù viết dài.</w:t>
       </w:r>
     </w:p>
     <w:p>
@@ -1857,7 +1866,7 @@
         <w:rPr>
           <w:b/>
         </w:rPr>
-        <w:t>Mục 1.2 chứng minh đề tài đáng làm, còn Mục 8 chứng minh khoảng trống tri thức nằm ở đâu.</w:t>
+        <w:t>Mục 1.2 chứng minh đề tài đáng làm, còn Mục 8 chứng minh khoảng trống nghiên cứu nằm ở đâu.</w:t>
       </w:r>
       <w:r>
         <w:t xml:space="preserve"> Nếu các em dồn tổng quan lên Mục 1.2 thì phần đặt vấn đề sẽ nặng trĩu, trong khi Mục 8 phía sau lại mỏng đi và trọng tâm của cả đề cương bị lệch.</w:t>
@@ -2059,15 +2068,15 @@
         <w:spacing w:after="160"/>
       </w:pPr>
       <w:r>
-        <w:t>Mục 8 làm một việc là tổng hợp có phê phán các nghiên cứu liên quan, để làm nền cho mục tiêu và câu hỏi nghiên cứu mà các em đã đặt ở Mục 2 và Mục 3. Nếu ngành của các em yêu cầu chỉ ra khoảng trống tri thức, tức research gap, thì đây chính là chỗ trình bày khoảng trống đó.</w:t>
-      </w:r>
-    </w:p>
-    <w:p>
-      <w:pPr>
-        <w:spacing w:after="160"/>
-      </w:pPr>
-      <w:r>
-        <w:t>Slide nêu ba tính chất và thầy muốn các em hiểu đúng từng tính chất. Tính toàn diện không có nghĩa là đọc hết mọi thứ trên đời, mà là không bỏ sót một mảng quan trọng, có lý thuyết lẫn thực nghiệm, có kinh điển lẫn mới, có trong nước lẫn ngoài nước. Tính phê phán là tính chất quyết định chất lượng của cả Mục 8, bởi vì chỉ khi các em so sánh, phân tích và đánh giá xem mỗi nghiên cứu đạt được gì, còn hạn chế ở đâu thì khoảng trống tri thức mới hiện ra. Còn tính phát triển là bước tiếp theo: từ những gì đã tổng hợp và phân tích, các em gợi mở những hướng cần nghiên cứu tiếp.</w:t>
+        <w:t>Mục 8 làm một việc là tổng hợp có phê phán các nghiên cứu liên quan, để làm nền cho mục tiêu và câu hỏi nghiên cứu mà các em đã đặt ở Mục 2 và Mục 3. Nếu ngành của các em yêu cầu chỉ ra khoảng trống nghiên cứu, tức research gap, thì đây chính là chỗ trình bày khoảng trống đó.</w:t>
+      </w:r>
+    </w:p>
+    <w:p>
+      <w:pPr>
+        <w:spacing w:after="160"/>
+      </w:pPr>
+      <w:r>
+        <w:t>Slide nêu ba tính chất và thầy muốn các em hiểu đúng từng tính chất. Tính toàn diện không có nghĩa là đọc hết mọi thứ trên đời, mà là không bỏ sót một mảng quan trọng, có lý thuyết lẫn thực nghiệm, có kinh điển lẫn mới, có trong nước lẫn ngoài nước. Tính phê phán là tính chất quyết định chất lượng của cả Mục 8, bởi vì chỉ khi các em so sánh, phân tích và đánh giá xem mỗi nghiên cứu đạt được gì, còn hạn chế ở đâu thì khoảng trống nghiên cứu mới hiện ra. Còn tính phát triển là bước tiếp theo: từ những gì đã tổng hợp và phân tích, các em gợi mở những hướng cần nghiên cứu tiếp.</w:t>
       </w:r>
     </w:p>
     <w:p>
@@ -2091,7 +2100,7 @@
         <w:spacing w:after="160"/>
       </w:pPr>
       <w:r>
-        <w:t>Cách sửa thì không khó. Trước khi viết lại, các em tự hỏi những nghiên cứu mình đã đọc giống nhau ở chỗ nào, khác nhau ở chỗ nào, kết quả có mâu thuẫn nhau không, vì khoảng trống tri thức thường nằm ở những điểm mà các nghiên cứu cho kết quả khác nhau hoặc ở những khía cạnh chưa ai nghiên cứu tới. Sau đó, mỗi đoạn các em viết nên kết thúc bằng một nhận định so sánh, chỉ ra nghiên cứu trước còn thiếu gì. Viết theo cách này, phần tổng quan thường ngắn lại mà rõ hơn hẳn, có khi mười lăm trang tóm tắt rút lại chỉ còn năm trang nhưng năm trang đó có lập luận.</w:t>
+        <w:t>Cách sửa thì không khó. Trước khi viết lại, các em tự hỏi những nghiên cứu mình đã đọc giống nhau ở chỗ nào, khác nhau ở chỗ nào, kết quả có mâu thuẫn nhau không, vì khoảng trống nghiên cứu thường nằm ở những điểm mà các nghiên cứu cho kết quả khác nhau hoặc ở những khía cạnh chưa ai nghiên cứu tới. Sau đó, mỗi đoạn các em viết nên kết thúc bằng một nhận định so sánh, chỉ ra nghiên cứu trước còn thiếu gì. Viết theo cách này, phần tổng quan thường ngắn lại mà rõ hơn hẳn, có khi mười lăm trang tóm tắt rút lại chỉ còn năm trang nhưng năm trang đó có lập luận.</w:t>
       </w:r>
     </w:p>
     <w:p>
@@ -2473,7 +2482,7 @@
         <w:spacing w:after="160"/>
       </w:pPr>
       <w:r>
-        <w:t>Bản tiếng Anh cũng cần được làm nghiêm túc như vậy, vì nó không phải phần dịch cho có. Thử hình dung một bạn quên bản tiếng Anh, tới lúc bị yêu cầu bổ sung thì dịch vội trong một đêm, thuật ngữ chuyên ngành sai và câu cú thì máy móc, người đọc tiếng Anh nhìn vào là thấy ngay. Cho nên làm song song từ đầu, viết chậm mà chính xác, thì đỡ hơn nhiều.</w:t>
+        <w:t>Bản tiếng Anh cũng cần được làm nghiêm túc như vậy, vì nó không phải phần dịch cho có. Thử hình dung một bạn quên bản tiếng Anh, tới lúc bị yêu cầu bổ sung thì dịch vội trong một đêm, thuật ngữ chuyên ngành sai và câu cú thì máy móc, người đọc tiếng Anh nhìn vào là thấy ngay. Cho nên các em viết bản tiếng Anh song song với bản tiếng Việt và tra đúng thuật ngữ ngay từ đầu, thay vì để tới phút cuối rồi dịch vội.</w:t>
       </w:r>
     </w:p>
     <w:p>
@@ -2527,7 +2536,7 @@
         <w:spacing w:after="160"/>
       </w:pPr>
       <w:r>
-        <w:t>Cái thầy muốn các em để ý là chữ "nhiệm vụ" ở tiêu đề cột, chứ không phải chủ đề. Phần mở đầu có nhiệm vụ giới thiệu. Phần tổng quan có nhiệm vụ chứng minh vì sao mục tiêu được đặt như vậy và khoảng trống tri thức nằm ở đâu. Phần nội dung và kết quả có nhiệm vụ trả lời câu hỏi bằng dữ liệu. Còn phần kết luận có nhiệm vụ khép lại theo từng câu hỏi đã đặt ra.</w:t>
+        <w:t>Cái thầy muốn các em để ý là chữ "nhiệm vụ" ở tiêu đề cột, chứ không phải chủ đề. Phần mở đầu có nhiệm vụ giới thiệu. Phần tổng quan có nhiệm vụ chứng minh vì sao mục tiêu được đặt như vậy và khoảng trống nghiên cứu nằm ở đâu. Phần nội dung và kết quả có nhiệm vụ trả lời câu hỏi bằng dữ liệu. Còn phần kết luận có nhiệm vụ khép lại theo từng câu hỏi đã đặt ra.</w:t>
       </w:r>
     </w:p>
     <w:p>
@@ -2627,7 +2636,7 @@
           <w:b/>
           <w:color w:val="1F4E78"/>
         </w:rPr>
-        <w:t>(Slide 48: tổng quan vấn đề nghiên cứu chứng minh khoảng trống tri thức, nội dung và kết quả nghiên cứu trả lời câu hỏi bằng dữ liệu thật)</w:t>
+        <w:t>(Slide 48: tổng quan vấn đề nghiên cứu chứng minh khoảng trống nghiên cứu, nội dung và kết quả nghiên cứu trả lời câu hỏi bằng dữ liệu thật)</w:t>
       </w:r>
     </w:p>
     <w:p>
@@ -2651,7 +2660,7 @@
         <w:spacing w:after="160"/>
       </w:pPr>
       <w:r>
-        <w:t>Còn về cách viết thì vẫn là chuyện mình đã nói ở Phần năm, tức là không tóm tắt rời rạc. Ở đây thầy cho các em thêm một công cụ rất thực tế. Trước khi viết, các em lập một bảng tổng hợp, trong đó mỗi dòng là một nghiên cứu còn các cột là tác giả, bối cảnh, phương pháp, kết quả chính và hạn chế. Làm xong bảng, các em đọc dọc từng cột. Đọc dọc cột bối cảnh, có thể các em thấy phần lớn nghiên cứu làm ở nước ngoài; đọc dọc cột phương pháp, có thể các em thấy ai cũng dùng một kiểu. Chính những điểm chung như vậy, chẳng hạn chưa ai nghiên cứu ở Việt Nam hay chưa ai thử một cách tiếp cận khác, là chỗ khoảng trống tri thức lộ ra.</w:t>
+        <w:t>Còn về cách viết thì vẫn là chuyện mình đã nói ở Phần năm, tức là không tóm tắt rời rạc. Ở đây thầy cho các em thêm một công cụ rất thực tế. Trước khi viết, các em lập một bảng tổng hợp, trong đó mỗi dòng là một nghiên cứu còn các cột là tác giả, bối cảnh, phương pháp, kết quả chính và hạn chế. Làm xong bảng, các em đọc dọc từng cột. Đọc dọc cột bối cảnh, có thể các em thấy phần lớn nghiên cứu làm ở nước ngoài; đọc dọc cột phương pháp, có thể các em thấy ai cũng dùng một kiểu. Chính những điểm chung như vậy, chẳng hạn chưa ai nghiên cứu ở Việt Nam hay chưa ai thử một cách tiếp cận khác, là chỗ khoảng trống nghiên cứu lộ ra.</w:t>
       </w:r>
     </w:p>
     <w:p>
@@ -3071,7 +3080,7 @@
         <w:t>kiểm tra khả năng tiếp cận dữ liệu trước rồi mới chốt phương pháp.</w:t>
       </w:r>
       <w:r>
-        <w:t xml:space="preserve"> Đây cũng chính là câu hỏi thứ hai trong checklist chọn đề tài ở Phần ba, câu "tôi biết chính xác dữ liệu cần thu thập và biết mình có thể tiếp cận được hay không". Các em thấy đó, một câu hỏi đặt sớm ở Phần ba đỡ được rất nhiều công sức ở Chương 3.</w:t>
+        <w:t xml:space="preserve"> Đây cũng chính là câu hỏi thứ hai trong checklist chọn đề tài ở Phần ba, câu "tôi biết chính xác dữ liệu cần thu thập và biết mình có thể tiếp cận được hay không". Các em thấy đó, nếu bạn kia trả lời nghiêm túc câu hỏi này ngay từ lúc chọn đề tài thì đã không mất gần hai tuần viết lại Chương 3.</w:t>
       </w:r>
     </w:p>
     <w:p>
@@ -4260,7 +4269,7 @@
         <w:rPr>
           <w:b/>
         </w:rPr>
-        <w:t>Nói cách khác, dày không có nghĩa là nặng ký.</w:t>
+        <w:t>Nói cách khác, bài dày không có nghĩa là bài có nhiều bằng chứng.</w:t>
       </w:r>
     </w:p>
     <w:p>

</xml_diff>